<commit_message>
added Terraform Task Documents
</commit_message>
<xml_diff>
--- a/ERRORS.docx
+++ b/ERRORS.docx
@@ -607,6 +607,9 @@
     </w:p>
     <w:p>
       <w:r>
+        <w:rPr>
+          <w:noProof/>
+        </w:rPr>
         <w:drawing>
           <wp:inline distT="0" distB="0" distL="0" distR="0" wp14:anchorId="5F517C06" wp14:editId="088EFA75">
             <wp:extent cx="5731510" cy="2287270"/>
@@ -646,6 +649,9 @@
     </w:p>
     <w:p>
       <w:r>
+        <w:rPr>
+          <w:noProof/>
+        </w:rPr>
         <w:lastRenderedPageBreak/>
         <w:drawing>
           <wp:inline distT="0" distB="0" distL="0" distR="0" wp14:anchorId="216321E9" wp14:editId="106F1FF8">
@@ -686,6 +692,9 @@
     </w:p>
     <w:p>
       <w:r>
+        <w:rPr>
+          <w:noProof/>
+        </w:rPr>
         <w:drawing>
           <wp:inline distT="0" distB="0" distL="0" distR="0" wp14:anchorId="30439EAC" wp14:editId="60769755">
             <wp:extent cx="5731510" cy="2729865"/>
@@ -725,6 +734,9 @@
     </w:p>
     <w:p>
       <w:r>
+        <w:rPr>
+          <w:noProof/>
+        </w:rPr>
         <w:drawing>
           <wp:inline distT="0" distB="0" distL="0" distR="0" wp14:anchorId="110E3F08" wp14:editId="465270C5">
             <wp:extent cx="5731510" cy="2729865"/>
@@ -763,7 +775,189 @@
       </w:r>
     </w:p>
     <w:p/>
-    <w:p/>
+    <w:p>
+      <w:r>
+        <w:lastRenderedPageBreak/>
+        <w:t xml:space="preserve">Used main in place of Master </w:t>
+      </w:r>
+      <w:r>
+        <w:sym w:font="Wingdings" w:char="F0E0"/>
+      </w:r>
+      <w:r>
+        <w:t xml:space="preserve"> for </w:t>
+      </w:r>
+      <w:proofErr w:type="spellStart"/>
+      <w:r>
+        <w:t>git</w:t>
+      </w:r>
+      <w:proofErr w:type="spellEnd"/>
+      <w:r>
+        <w:t xml:space="preserve"> repo</w:t>
+      </w:r>
+    </w:p>
+    <w:p>
+      <w:r>
+        <w:rPr>
+          <w:noProof/>
+        </w:rPr>
+        <mc:AlternateContent>
+          <mc:Choice Requires="wps">
+            <w:drawing>
+              <wp:anchor distT="0" distB="0" distL="114300" distR="114300" simplePos="0" relativeHeight="251659264" behindDoc="0" locked="0" layoutInCell="1" allowOverlap="1" wp14:anchorId="43E8D17E" wp14:editId="6A6BD570">
+                <wp:simplePos x="0" y="0"/>
+                <wp:positionH relativeFrom="column">
+                  <wp:posOffset>1047750</wp:posOffset>
+                </wp:positionH>
+                <wp:positionV relativeFrom="paragraph">
+                  <wp:posOffset>1638935</wp:posOffset>
+                </wp:positionV>
+                <wp:extent cx="450850" cy="127000"/>
+                <wp:effectExtent l="0" t="19050" r="44450" b="44450"/>
+                <wp:wrapNone/>
+                <wp:docPr id="220642838" name="Arrow: Right 1"/>
+                <wp:cNvGraphicFramePr/>
+                <a:graphic xmlns:a="http://schemas.openxmlformats.org/drawingml/2006/main">
+                  <a:graphicData uri="http://schemas.microsoft.com/office/word/2010/wordprocessingShape">
+                    <wps:wsp>
+                      <wps:cNvSpPr/>
+                      <wps:spPr>
+                        <a:xfrm>
+                          <a:off x="0" y="0"/>
+                          <a:ext cx="450850" cy="127000"/>
+                        </a:xfrm>
+                        <a:prstGeom prst="rightArrow">
+                          <a:avLst/>
+                        </a:prstGeom>
+                        <a:solidFill>
+                          <a:srgbClr val="EE0000"/>
+                        </a:solidFill>
+                      </wps:spPr>
+                      <wps:style>
+                        <a:lnRef idx="2">
+                          <a:schemeClr val="dk1">
+                            <a:shade val="15000"/>
+                          </a:schemeClr>
+                        </a:lnRef>
+                        <a:fillRef idx="1">
+                          <a:schemeClr val="dk1"/>
+                        </a:fillRef>
+                        <a:effectRef idx="0">
+                          <a:schemeClr val="dk1"/>
+                        </a:effectRef>
+                        <a:fontRef idx="minor">
+                          <a:schemeClr val="lt1"/>
+                        </a:fontRef>
+                      </wps:style>
+                      <wps:bodyPr rot="0" spcFirstLastPara="0" vertOverflow="overflow" horzOverflow="overflow" vert="horz" wrap="square" lIns="91440" tIns="45720" rIns="91440" bIns="45720" numCol="1" spcCol="0" rtlCol="0" fromWordArt="0" anchor="ctr" anchorCtr="0" forceAA="0" compatLnSpc="1">
+                        <a:prstTxWarp prst="textNoShape">
+                          <a:avLst/>
+                        </a:prstTxWarp>
+                        <a:noAutofit/>
+                      </wps:bodyPr>
+                    </wps:wsp>
+                  </a:graphicData>
+                </a:graphic>
+              </wp:anchor>
+            </w:drawing>
+          </mc:Choice>
+          <mc:Fallback>
+            <w:pict>
+              <v:shapetype w14:anchorId="09DDD260" id="_x0000_t13" coordsize="21600,21600" o:spt="13" adj="16200,5400" path="m@0,l@0@1,0@1,0@2@0@2@0,21600,21600,10800xe">
+                <v:stroke joinstyle="miter"/>
+                <v:formulas>
+                  <v:f eqn="val #0"/>
+                  <v:f eqn="val #1"/>
+                  <v:f eqn="sum height 0 #1"/>
+                  <v:f eqn="sum 10800 0 #1"/>
+                  <v:f eqn="sum width 0 #0"/>
+                  <v:f eqn="prod @4 @3 10800"/>
+                  <v:f eqn="sum width 0 @5"/>
+                </v:formulas>
+                <v:path o:connecttype="custom" o:connectlocs="@0,0;0,10800;@0,21600;21600,10800" o:connectangles="270,180,90,0" textboxrect="0,@1,@6,@2"/>
+                <v:handles>
+                  <v:h position="#0,#1" xrange="0,21600" yrange="0,10800"/>
+                </v:handles>
+              </v:shapetype>
+              <v:shape id="Arrow: Right 1" o:spid="_x0000_s1026" type="#_x0000_t13" style="position:absolute;margin-left:82.5pt;margin-top:129.05pt;width:35.5pt;height:10pt;z-index:251659264;visibility:visible;mso-wrap-style:square;mso-wrap-distance-left:9pt;mso-wrap-distance-top:0;mso-wrap-distance-right:9pt;mso-wrap-distance-bottom:0;mso-position-horizontal:absolute;mso-position-horizontal-relative:text;mso-position-vertical:absolute;mso-position-vertical-relative:text;v-text-anchor:middle" o:gfxdata="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" adj="18558" fillcolor="#e00" strokecolor="black [480]" strokeweight="1.5pt"/>
+            </w:pict>
+          </mc:Fallback>
+        </mc:AlternateContent>
+      </w:r>
+      <w:r>
+        <w:drawing>
+          <wp:inline distT="0" distB="0" distL="0" distR="0" wp14:anchorId="625321DE" wp14:editId="19C0276A">
+            <wp:extent cx="5731510" cy="2454275"/>
+            <wp:effectExtent l="0" t="0" r="2540" b="3175"/>
+            <wp:docPr id="1997862462" name="Picture 1"/>
+            <wp:cNvGraphicFramePr>
+              <a:graphicFrameLocks xmlns:a="http://schemas.openxmlformats.org/drawingml/2006/main" noChangeAspect="1"/>
+            </wp:cNvGraphicFramePr>
+            <a:graphic xmlns:a="http://schemas.openxmlformats.org/drawingml/2006/main">
+              <a:graphicData uri="http://schemas.openxmlformats.org/drawingml/2006/picture">
+                <pic:pic xmlns:pic="http://schemas.openxmlformats.org/drawingml/2006/picture">
+                  <pic:nvPicPr>
+                    <pic:cNvPr id="1997862462" name=""/>
+                    <pic:cNvPicPr/>
+                  </pic:nvPicPr>
+                  <pic:blipFill>
+                    <a:blip r:embed="rId16"/>
+                    <a:stretch>
+                      <a:fillRect/>
+                    </a:stretch>
+                  </pic:blipFill>
+                  <pic:spPr>
+                    <a:xfrm>
+                      <a:off x="0" y="0"/>
+                      <a:ext cx="5731510" cy="2454275"/>
+                    </a:xfrm>
+                    <a:prstGeom prst="rect">
+                      <a:avLst/>
+                    </a:prstGeom>
+                  </pic:spPr>
+                </pic:pic>
+              </a:graphicData>
+            </a:graphic>
+          </wp:inline>
+        </w:drawing>
+      </w:r>
+      <w:r>
+        <w:drawing>
+          <wp:inline distT="0" distB="0" distL="0" distR="0" wp14:anchorId="4A1F2A73" wp14:editId="25B93825">
+            <wp:extent cx="5731510" cy="2756535"/>
+            <wp:effectExtent l="0" t="0" r="2540" b="5715"/>
+            <wp:docPr id="764298983" name="Picture 1"/>
+            <wp:cNvGraphicFramePr>
+              <a:graphicFrameLocks xmlns:a="http://schemas.openxmlformats.org/drawingml/2006/main" noChangeAspect="1"/>
+            </wp:cNvGraphicFramePr>
+            <a:graphic xmlns:a="http://schemas.openxmlformats.org/drawingml/2006/main">
+              <a:graphicData uri="http://schemas.openxmlformats.org/drawingml/2006/picture">
+                <pic:pic xmlns:pic="http://schemas.openxmlformats.org/drawingml/2006/picture">
+                  <pic:nvPicPr>
+                    <pic:cNvPr id="764298983" name=""/>
+                    <pic:cNvPicPr/>
+                  </pic:nvPicPr>
+                  <pic:blipFill>
+                    <a:blip r:embed="rId17"/>
+                    <a:stretch>
+                      <a:fillRect/>
+                    </a:stretch>
+                  </pic:blipFill>
+                  <pic:spPr>
+                    <a:xfrm>
+                      <a:off x="0" y="0"/>
+                      <a:ext cx="5731510" cy="2756535"/>
+                    </a:xfrm>
+                    <a:prstGeom prst="rect">
+                      <a:avLst/>
+                    </a:prstGeom>
+                  </pic:spPr>
+                </pic:pic>
+              </a:graphicData>
+            </a:graphic>
+          </wp:inline>
+        </w:drawing>
+      </w:r>
+    </w:p>
     <w:sectPr>
       <w:pgSz w:w="11906" w:h="16838"/>
       <w:pgMar w:top="1440" w:right="1440" w:bottom="1440" w:left="1440" w:header="708" w:footer="708" w:gutter="0"/>

</xml_diff>